<commit_message>
Polish revised scholarly document
Co-authored-by: pingpong-coder <193797080+pingpong-coder@users.noreply.github.com>
</commit_message>
<xml_diff>
--- a/anorectal disorders 2022-2023 2 (1)-1_revised.docx
+++ b/anorectal disorders 2022-2023 2 (1)-1_revised.docx
@@ -51,103 +51,16 @@
         <w:ind w:left="2987" w:right="4808" w:firstLine="542"/>
       </w:pPr>
       <w:r>
-        <w:rPr/>
-        <w:drawing>
-          <wp:anchor distT="0" distB="0" distL="0" distR="0" allowOverlap="1" layoutInCell="1" locked="0" behindDoc="0" simplePos="0" relativeHeight="15729152">
-            <wp:simplePos x="0" y="0"/>
-            <wp:positionH relativeFrom="page">
-              <wp:posOffset>6195059</wp:posOffset>
-            </wp:positionH>
-            <wp:positionV relativeFrom="paragraph">
-              <wp:posOffset>-285492</wp:posOffset>
-            </wp:positionV>
-            <wp:extent cx="1280160" cy="1363979"/>
-            <wp:effectExtent l="0" t="0" r="0" b="0"/>
-            <wp:wrapNone/>
-            <wp:docPr id="1" name="image3.jpeg" descr="C:\Users\DR Azza\Desktop\28233295_1271340249633136_1553563886_n.jpg"/>
-            <wp:cNvGraphicFramePr>
-              <a:graphicFrameLocks noChangeAspect="1"/>
-            </wp:cNvGraphicFramePr>
-            <a:graphic>
-              <a:graphicData uri="http://schemas.openxmlformats.org/drawingml/2006/picture">
-                <pic:pic>
-                  <pic:nvPicPr>
-                    <pic:cNvPr id="2" name="image3.jpeg"/>
-                    <pic:cNvPicPr/>
-                  </pic:nvPicPr>
-                  <pic:blipFill>
-                    <a:blip r:embed="rId7" cstate="print"/>
-                    <a:stretch>
-                      <a:fillRect/>
-                    </a:stretch>
-                  </pic:blipFill>
-                  <pic:spPr>
-                    <a:xfrm>
-                      <a:off x="0" y="0"/>
-                      <a:ext cx="1280160" cy="1363979"/>
-                    </a:xfrm>
-                    <a:prstGeom prst="rect">
-                      <a:avLst/>
-                    </a:prstGeom>
-                  </pic:spPr>
-                </pic:pic>
-              </a:graphicData>
-            </a:graphic>
-          </wp:anchor>
-        </w:drawing>
-      </w:r>
-      <w:r>
-        <w:rPr/>
-        <w:t>Faculty of nursing</w:t>
-      </w:r>
-      <w:r>
-        <w:rPr>
-          <w:spacing w:val="1"/>
-        </w:rPr>
-        <w:t> </w:t>
-      </w:r>
-      <w:r>
-        <w:rPr/>
-        <w:t>Medical Surgical Nursing</w:t>
-      </w:r>
-      <w:r>
-        <w:rPr>
-          <w:spacing w:val="1"/>
-        </w:rPr>
-        <w:t> </w:t>
-      </w:r>
-      <w:r>
-        <w:rPr/>
-        <w:t>Medical Surgical II Course</w:t>
-      </w:r>
-      <w:r>
-        <w:rPr>
-          <w:spacing w:val="1"/>
-        </w:rPr>
-        <w:t> </w:t>
-      </w:r>
-      <w:r>
-        <w:rPr/>
-        <w:t>Surgical</w:t>
-      </w:r>
-      <w:r>
-        <w:rPr>
-          <w:spacing w:val="-7"/>
-        </w:rPr>
-        <w:t> </w:t>
-      </w:r>
-      <w:r>
-        <w:rPr/>
-        <w:t>rotation</w:t>
-      </w:r>
-      <w:r>
-        <w:rPr>
-          <w:spacing w:val="-10"/>
-        </w:rPr>
-        <w:t> </w:t>
-      </w:r>
-      <w:r>
-        <w:rPr/>
+        <w:rPr>
+          <w:b/>
+          <w:color w:val="0066CC"/>
+        </w:rPr>
+        <w:t>Faculty of Nursing</w:t>
+        <w:br/>
+        <w:t>Medical-Surgical Nursing II Course</w:t>
+        <w:br/>
+        <w:t>Surgical Rotation</w:t>
+        <w:br/>
         <w:t>2022/2023</w:t>
       </w:r>
     </w:p>
@@ -410,85 +323,12 @@
       </w:pPr>
       <w:r>
         <w:rPr>
-          <w:i/>
-          <w:sz w:val="44"/>
-        </w:rPr>
-        <w:t>Dr/</w:t>
-      </w:r>
-      <w:r>
-        <w:rPr>
-          <w:i/>
-          <w:spacing w:val="-9"/>
-          <w:sz w:val="44"/>
-        </w:rPr>
-        <w:t> </w:t>
-      </w:r>
-      <w:r>
-        <w:rPr>
-          <w:i/>
-          <w:sz w:val="44"/>
-        </w:rPr>
-        <w:t>Asmaa</w:t>
-      </w:r>
-      <w:r>
-        <w:rPr>
-          <w:i/>
-          <w:spacing w:val="-6"/>
-          <w:sz w:val="44"/>
-        </w:rPr>
-        <w:t> </w:t>
-      </w:r>
-      <w:r>
-        <w:rPr>
-          <w:i/>
-          <w:sz w:val="44"/>
-        </w:rPr>
-        <w:t>Abdel</w:t>
-      </w:r>
-      <w:r>
-        <w:rPr>
-          <w:i/>
-          <w:spacing w:val="-7"/>
-          <w:sz w:val="44"/>
-        </w:rPr>
-        <w:t> </w:t>
-      </w:r>
-      <w:r>
-        <w:rPr>
-          <w:i/>
-          <w:sz w:val="44"/>
-        </w:rPr>
-        <w:t>Hafez</w:t>
-      </w:r>
-      <w:r>
-        <w:rPr>
-          <w:i/>
-          <w:spacing w:val="-107"/>
-          <w:sz w:val="44"/>
-        </w:rPr>
-        <w:t> </w:t>
-      </w:r>
-      <w:r>
-        <w:rPr>
-          <w:i/>
-          <w:sz w:val="44"/>
-        </w:rPr>
-        <w:t>Dr/</w:t>
-      </w:r>
-      <w:r>
-        <w:rPr>
-          <w:i/>
-          <w:spacing w:val="-4"/>
-          <w:sz w:val="44"/>
-        </w:rPr>
-        <w:t> </w:t>
-      </w:r>
-      <w:r>
-        <w:rPr>
-          <w:i/>
-          <w:sz w:val="44"/>
-        </w:rPr>
-        <w:t>Yasser Mahmoud</w:t>
+          <w:b/>
+          <w:color w:val="0066CC"/>
+        </w:rPr>
+        <w:t>Dr. Asmaa Abdel Hafez</w:t>
+        <w:br/>
+        <w:t>Dr. Yasser Mahmoud</w:t>
       </w:r>
     </w:p>
     <w:p>

</xml_diff>